<commit_message>
GameRoomInfos.json, 공장 맵 구조 문서 수정
13 Staircase 사이즈 및 문 위치 수정
</commit_message>
<xml_diff>
--- a/기획/공장 맵_방 구조 규칙_0203.docx
+++ b/기획/공장 맵_방 구조 규칙_0203.docx
@@ -64,28 +64,12 @@
     </w:p>
     <w:p/>
     <w:p>
-      <w:proofErr w:type="gramStart"/>
       <w:r>
         <w:rPr>
           <w:rFonts w:hint="eastAsia"/>
         </w:rPr>
-        <w:t>[ 참고</w:t>
+        <w:t>[ 참고 사항 ]</w:t>
       </w:r>
-      <w:proofErr w:type="gramEnd"/>
-      <w:r>
-        <w:rPr>
-          <w:rFonts w:hint="eastAsia"/>
-        </w:rPr>
-        <w:t xml:space="preserve"> </w:t>
-      </w:r>
-      <w:proofErr w:type="gramStart"/>
-      <w:r>
-        <w:rPr>
-          <w:rFonts w:hint="eastAsia"/>
-        </w:rPr>
-        <w:t>사항 ]</w:t>
-      </w:r>
-      <w:proofErr w:type="gramEnd"/>
     </w:p>
     <w:p>
       <w:pPr>
@@ -251,7 +235,6 @@
     </w:p>
     <w:p/>
     <w:p>
-      <w:proofErr w:type="gramStart"/>
       <w:r>
         <w:rPr>
           <w:rFonts w:hint="eastAsia"/>
@@ -268,14 +251,7 @@
         <w:rPr>
           <w:rFonts w:hint="eastAsia"/>
         </w:rPr>
-        <w:t>모든</w:t>
-      </w:r>
-      <w:proofErr w:type="gramEnd"/>
-      <w:r>
-        <w:rPr>
-          <w:rFonts w:hint="eastAsia"/>
-        </w:rPr>
-        <w:t xml:space="preserve"> 스테이지 </w:t>
+        <w:t xml:space="preserve">모든 스테이지 </w:t>
       </w:r>
       <w:r>
         <w:rPr>
@@ -293,14 +269,7 @@
         <w:rPr>
           <w:rFonts w:hint="eastAsia"/>
         </w:rPr>
-        <w:t xml:space="preserve"> &amp; </w:t>
-      </w:r>
-      <w:proofErr w:type="gramStart"/>
-      <w:r>
-        <w:rPr>
-          <w:rFonts w:hint="eastAsia"/>
-        </w:rPr>
-        <w:t>규칙</w:t>
+        <w:t xml:space="preserve"> &amp; 규칙</w:t>
       </w:r>
       <w:r>
         <w:rPr>
@@ -308,7 +277,6 @@
         </w:rPr>
         <w:t xml:space="preserve"> ]</w:t>
       </w:r>
-      <w:proofErr w:type="gramEnd"/>
     </w:p>
     <w:p>
       <w:pPr>
@@ -336,19 +304,11 @@
       <w:r>
         <w:t>’</w:t>
       </w:r>
-      <w:proofErr w:type="spellStart"/>
       <w:r>
         <w:rPr>
           <w:rFonts w:hint="eastAsia"/>
         </w:rPr>
-        <w:t>를</w:t>
-      </w:r>
-      <w:proofErr w:type="spellEnd"/>
-      <w:r>
-        <w:rPr>
-          <w:rFonts w:hint="eastAsia"/>
-        </w:rPr>
-        <w:t xml:space="preserve"> 이용하여 열 수 있다.</w:t>
+        <w:t>를 이용하여 열 수 있다.</w:t>
       </w:r>
     </w:p>
     <w:p>
@@ -363,21 +323,7 @@
         <w:rPr>
           <w:rFonts w:hint="eastAsia"/>
         </w:rPr>
-        <w:t xml:space="preserve">코어(장치)는 한 </w:t>
-      </w:r>
-      <w:proofErr w:type="spellStart"/>
-      <w:r>
-        <w:rPr>
-          <w:rFonts w:hint="eastAsia"/>
-        </w:rPr>
-        <w:t>맵에</w:t>
-      </w:r>
-      <w:proofErr w:type="spellEnd"/>
-      <w:r>
-        <w:rPr>
-          <w:rFonts w:hint="eastAsia"/>
-        </w:rPr>
-        <w:t xml:space="preserve"> 하나만 생성될 수 있다.</w:t>
+        <w:t>코어(장치)는 한 맵에 하나만 생성될 수 있다.</w:t>
       </w:r>
     </w:p>
     <w:p>
@@ -484,19 +430,11 @@
       <w:r>
         <w:t>’</w:t>
       </w:r>
-      <w:proofErr w:type="spellStart"/>
       <w:r>
         <w:rPr>
           <w:rFonts w:hint="eastAsia"/>
         </w:rPr>
-        <w:t>끼리는</w:t>
-      </w:r>
-      <w:proofErr w:type="spellEnd"/>
-      <w:r>
-        <w:rPr>
-          <w:rFonts w:hint="eastAsia"/>
-        </w:rPr>
-        <w:t xml:space="preserve"> 바로 연결될 수 없다.</w:t>
+        <w:t>끼리는 바로 연결될 수 없다.</w:t>
       </w:r>
     </w:p>
     <w:p>
@@ -519,19 +457,11 @@
       <w:r>
         <w:t>’</w:t>
       </w:r>
-      <w:proofErr w:type="spellStart"/>
       <w:r>
         <w:rPr>
           <w:rFonts w:hint="eastAsia"/>
         </w:rPr>
-        <w:t>끼리는</w:t>
-      </w:r>
-      <w:proofErr w:type="spellEnd"/>
-      <w:r>
-        <w:rPr>
-          <w:rFonts w:hint="eastAsia"/>
-        </w:rPr>
-        <w:t xml:space="preserve"> 바로 연결될 수 있다.</w:t>
+        <w:t>끼리는 바로 연결될 수 있다.</w:t>
       </w:r>
     </w:p>
     <w:p>
@@ -554,19 +484,11 @@
       <w:r>
         <w:t>’</w:t>
       </w:r>
-      <w:proofErr w:type="spellStart"/>
       <w:r>
         <w:rPr>
           <w:rFonts w:hint="eastAsia"/>
         </w:rPr>
-        <w:t>끼리는</w:t>
-      </w:r>
-      <w:proofErr w:type="spellEnd"/>
-      <w:r>
-        <w:rPr>
-          <w:rFonts w:hint="eastAsia"/>
-        </w:rPr>
-        <w:t xml:space="preserve"> 바로 연결될 수 있다.</w:t>
+        <w:t>끼리는 바로 연결될 수 있다.</w:t>
       </w:r>
     </w:p>
     <w:p>
@@ -624,38 +546,7 @@
                 <w:sz w:val="24"/>
               </w:rPr>
               <w:lastRenderedPageBreak/>
-              <w:t xml:space="preserve">0 </w:t>
-            </w:r>
-            <w:proofErr w:type="spellStart"/>
-            <w:proofErr w:type="gramStart"/>
-            <w:r>
-              <w:rPr>
-                <w:rFonts w:hint="eastAsia"/>
-                <w:b/>
-                <w:bCs/>
-                <w:sz w:val="24"/>
-              </w:rPr>
-              <w:t>MainEntranceRoom</w:t>
-            </w:r>
-            <w:proofErr w:type="spellEnd"/>
-            <w:r>
-              <w:rPr>
-                <w:rFonts w:hint="eastAsia"/>
-                <w:b/>
-                <w:bCs/>
-                <w:sz w:val="24"/>
-              </w:rPr>
-              <w:t xml:space="preserve"> /</w:t>
-            </w:r>
-            <w:proofErr w:type="gramEnd"/>
-            <w:r>
-              <w:rPr>
-                <w:rFonts w:hint="eastAsia"/>
-                <w:b/>
-                <w:bCs/>
-                <w:sz w:val="24"/>
-              </w:rPr>
-              <w:t xml:space="preserve"> 메인 입구 방</w:t>
+              <w:t>0 MainEntranceRoom / 메인 입구 방</w:t>
             </w:r>
           </w:p>
         </w:tc>
@@ -1194,38 +1085,7 @@
                 <w:bCs/>
                 <w:sz w:val="24"/>
               </w:rPr>
-              <w:t xml:space="preserve">1 </w:t>
-            </w:r>
-            <w:proofErr w:type="spellStart"/>
-            <w:proofErr w:type="gramStart"/>
-            <w:r>
-              <w:rPr>
-                <w:rFonts w:hint="eastAsia"/>
-                <w:b/>
-                <w:bCs/>
-                <w:sz w:val="24"/>
-              </w:rPr>
-              <w:t>GapRoom</w:t>
-            </w:r>
-            <w:proofErr w:type="spellEnd"/>
-            <w:r>
-              <w:rPr>
-                <w:rFonts w:hint="eastAsia"/>
-                <w:b/>
-                <w:bCs/>
-                <w:sz w:val="24"/>
-              </w:rPr>
-              <w:t xml:space="preserve"> /</w:t>
-            </w:r>
-            <w:proofErr w:type="gramEnd"/>
-            <w:r>
-              <w:rPr>
-                <w:rFonts w:hint="eastAsia"/>
-                <w:b/>
-                <w:bCs/>
-                <w:sz w:val="24"/>
-              </w:rPr>
-              <w:t xml:space="preserve"> 끊어진 방</w:t>
+              <w:t>1 GapRoom / 끊어진 방</w:t>
             </w:r>
           </w:p>
         </w:tc>
@@ -1752,38 +1612,7 @@
                 <w:bCs/>
                 <w:sz w:val="24"/>
               </w:rPr>
-              <w:t xml:space="preserve">2 </w:t>
-            </w:r>
-            <w:proofErr w:type="spellStart"/>
-            <w:proofErr w:type="gramStart"/>
-            <w:r>
-              <w:rPr>
-                <w:rFonts w:hint="eastAsia"/>
-                <w:b/>
-                <w:bCs/>
-                <w:sz w:val="24"/>
-              </w:rPr>
-              <w:t>ApparatusRoom</w:t>
-            </w:r>
-            <w:proofErr w:type="spellEnd"/>
-            <w:r>
-              <w:rPr>
-                <w:rFonts w:hint="eastAsia"/>
-                <w:b/>
-                <w:bCs/>
-                <w:sz w:val="24"/>
-              </w:rPr>
-              <w:t xml:space="preserve"> /</w:t>
-            </w:r>
-            <w:proofErr w:type="gramEnd"/>
-            <w:r>
-              <w:rPr>
-                <w:rFonts w:hint="eastAsia"/>
-                <w:b/>
-                <w:bCs/>
-                <w:sz w:val="24"/>
-              </w:rPr>
-              <w:t xml:space="preserve"> 장치 방(구조 1, 구조 2)</w:t>
+              <w:t>2 ApparatusRoom / 장치 방(구조 1, 구조 2)</w:t>
             </w:r>
           </w:p>
         </w:tc>
@@ -2478,38 +2307,7 @@
                 <w:bCs/>
                 <w:sz w:val="24"/>
               </w:rPr>
-              <w:t xml:space="preserve">3 </w:t>
-            </w:r>
-            <w:proofErr w:type="spellStart"/>
-            <w:proofErr w:type="gramStart"/>
-            <w:r>
-              <w:rPr>
-                <w:rFonts w:hint="eastAsia"/>
-                <w:b/>
-                <w:bCs/>
-                <w:sz w:val="24"/>
-              </w:rPr>
-              <w:t>ServerRoom</w:t>
-            </w:r>
-            <w:proofErr w:type="spellEnd"/>
-            <w:r>
-              <w:rPr>
-                <w:rFonts w:hint="eastAsia"/>
-                <w:b/>
-                <w:bCs/>
-                <w:sz w:val="24"/>
-              </w:rPr>
-              <w:t xml:space="preserve"> /</w:t>
-            </w:r>
-            <w:proofErr w:type="gramEnd"/>
-            <w:r>
-              <w:rPr>
-                <w:rFonts w:hint="eastAsia"/>
-                <w:b/>
-                <w:bCs/>
-                <w:sz w:val="24"/>
-              </w:rPr>
-              <w:t xml:space="preserve"> 서버 방</w:t>
+              <w:t>3 ServerRoom / 서버 방</w:t>
             </w:r>
           </w:p>
         </w:tc>
@@ -3010,58 +2808,7 @@
                 <w:bCs/>
                 <w:sz w:val="24"/>
               </w:rPr>
-              <w:t xml:space="preserve">4 </w:t>
-            </w:r>
-            <w:proofErr w:type="spellStart"/>
-            <w:proofErr w:type="gramStart"/>
-            <w:r>
-              <w:rPr>
-                <w:rFonts w:hint="eastAsia"/>
-                <w:b/>
-                <w:bCs/>
-                <w:sz w:val="24"/>
-              </w:rPr>
-              <w:t>CabinetRoom</w:t>
-            </w:r>
-            <w:proofErr w:type="spellEnd"/>
-            <w:r>
-              <w:rPr>
-                <w:rFonts w:hint="eastAsia"/>
-                <w:b/>
-                <w:bCs/>
-                <w:sz w:val="24"/>
-              </w:rPr>
-              <w:t xml:space="preserve"> /</w:t>
-            </w:r>
-            <w:proofErr w:type="gramEnd"/>
-            <w:r>
-              <w:rPr>
-                <w:rFonts w:hint="eastAsia"/>
-                <w:b/>
-                <w:bCs/>
-                <w:sz w:val="24"/>
-              </w:rPr>
-              <w:t xml:space="preserve"> </w:t>
-            </w:r>
-            <w:proofErr w:type="spellStart"/>
-            <w:r>
-              <w:rPr>
-                <w:rFonts w:hint="eastAsia"/>
-                <w:b/>
-                <w:bCs/>
-                <w:sz w:val="24"/>
-              </w:rPr>
-              <w:t>캐비넷</w:t>
-            </w:r>
-            <w:proofErr w:type="spellEnd"/>
-            <w:r>
-              <w:rPr>
-                <w:rFonts w:hint="eastAsia"/>
-                <w:b/>
-                <w:bCs/>
-                <w:sz w:val="24"/>
-              </w:rPr>
-              <w:t xml:space="preserve"> 방</w:t>
+              <w:t>4 CabinetRoom / 캐비넷 방</w:t>
             </w:r>
           </w:p>
         </w:tc>
@@ -3736,35 +3483,7 @@
         <w:rPr>
           <w:rFonts w:hint="eastAsia"/>
         </w:rPr>
-        <w:t xml:space="preserve">: 대각선으로 마주보는 모서리에 최대 2개의 </w:t>
-      </w:r>
-      <w:proofErr w:type="spellStart"/>
-      <w:r>
-        <w:rPr>
-          <w:rFonts w:hint="eastAsia"/>
-        </w:rPr>
-        <w:t>캐비넷이</w:t>
-      </w:r>
-      <w:proofErr w:type="spellEnd"/>
-      <w:r>
-        <w:rPr>
-          <w:rFonts w:hint="eastAsia"/>
-        </w:rPr>
-        <w:t xml:space="preserve"> 생성될 수 있다. </w:t>
-      </w:r>
-      <w:proofErr w:type="spellStart"/>
-      <w:r>
-        <w:rPr>
-          <w:rFonts w:hint="eastAsia"/>
-        </w:rPr>
-        <w:t>캐비넷은</w:t>
-      </w:r>
-      <w:proofErr w:type="spellEnd"/>
-      <w:r>
-        <w:rPr>
-          <w:rFonts w:hint="eastAsia"/>
-        </w:rPr>
-        <w:t xml:space="preserve"> 생성되더라도 열리지 않을 수도 있다.</w:t>
+        <w:t>: 대각선으로 마주보는 모서리에 최대 2개의 캐비넷이 생성될 수 있다. 캐비넷은 생성되더라도 열리지 않을 수도 있다.</w:t>
       </w:r>
     </w:p>
     <w:p>
@@ -5538,21 +5257,7 @@
         <w:rPr>
           <w:rFonts w:hint="eastAsia"/>
         </w:rPr>
-        <w:t xml:space="preserve">: </w:t>
-      </w:r>
-      <w:proofErr w:type="spellStart"/>
-      <w:r>
-        <w:rPr>
-          <w:rFonts w:hint="eastAsia"/>
-        </w:rPr>
-        <w:t>꺾임형</w:t>
-      </w:r>
-      <w:proofErr w:type="spellEnd"/>
-      <w:r>
-        <w:rPr>
-          <w:rFonts w:hint="eastAsia"/>
-        </w:rPr>
-        <w:t xml:space="preserve"> </w:t>
+        <w:t xml:space="preserve">: 꺾임형 </w:t>
       </w:r>
       <w:r>
         <w:t>–</w:t>
@@ -7860,9 +7565,6 @@
               <w:pStyle w:val="a6"/>
               <w:ind w:left="0"/>
               <w:jc w:val="center"/>
-              <w:rPr>
-                <w:rFonts w:hint="eastAsia"/>
-              </w:rPr>
             </w:pPr>
             <w:r>
               <w:t>총 방 개수 최소/최대 - 아이템 생성 방 개수 최소/최대</w:t>
@@ -9043,7 +8745,25 @@
               <w:rPr>
                 <w:rFonts w:hint="eastAsia"/>
               </w:rPr>
-              <w:t>6*6*15</w:t>
+              <w:t>8</w:t>
+            </w:r>
+            <w:r>
+              <w:rPr>
+                <w:rFonts w:hint="eastAsia"/>
+              </w:rPr>
+              <w:t>*</w:t>
+            </w:r>
+            <w:r>
+              <w:rPr>
+                <w:rFonts w:hint="eastAsia"/>
+              </w:rPr>
+              <w:t>8</w:t>
+            </w:r>
+            <w:r>
+              <w:rPr>
+                <w:rFonts w:hint="eastAsia"/>
+              </w:rPr>
+              <w:t>*15</w:t>
             </w:r>
           </w:p>
         </w:tc>
@@ -9248,9 +8968,6 @@
               <w:pStyle w:val="a6"/>
               <w:ind w:left="0"/>
               <w:jc w:val="center"/>
-              <w:rPr>
-                <w:rFonts w:hint="eastAsia"/>
-              </w:rPr>
             </w:pPr>
             <w:r>
               <w:t>'최소/최대 층수 - 1'</w:t>

</xml_diff>